<commit_message>
Added captions to the SQL Server install doc.
</commit_message>
<xml_diff>
--- a/assignments/sql_server_install/SQL Server on Docker Install Log.docx
+++ b/assignments/sql_server_install/SQL Server on Docker Install Log.docx
@@ -49,7 +49,21 @@
     </w:p>
     <w:p>
       <w:r>
-        <w:t xml:space="preserve">Networking is setup and validated – ssh works. I’ll probably need to open a firewall hole for port 1433 (SQL Server default). Docker is already installed on </w:t>
+        <w:t xml:space="preserve">Networking is setup and validated – ssh works. </w:t>
+      </w:r>
+      <w:r>
+        <w:t>Open</w:t>
+      </w:r>
+      <w:r>
+        <w:t xml:space="preserve"> </w:t>
+      </w:r>
+      <w:proofErr w:type="spellStart"/>
+      <w:r>
+        <w:t>open</w:t>
+      </w:r>
+      <w:proofErr w:type="spellEnd"/>
+      <w:r>
+        <w:t xml:space="preserve"> a firewall hole for port 1433 (SQL Server default). Docker is already installed on </w:t>
       </w:r>
       <w:proofErr w:type="spellStart"/>
       <w:r>
@@ -290,14 +304,13 @@
     </w:p>
     <w:p>
       <w:pPr>
+        <w:keepNext/>
         <w:spacing w:after="0" w:line="240" w:lineRule="auto"/>
-        <w:rPr>
-          <w:rFonts w:ascii="Courier New" w:hAnsi="Courier New" w:cs="Courier New"/>
-        </w:rPr>
-      </w:pPr>
-      <w:r>
-        <w:rPr>
-          <w:rFonts w:ascii="Courier New" w:hAnsi="Courier New" w:cs="Courier New"/>
+      </w:pPr>
+      <w:r>
+        <w:rPr>
+          <w:rFonts w:ascii="Courier New" w:hAnsi="Courier New" w:cs="Courier New"/>
+          <w:noProof/>
         </w:rPr>
         <w:lastRenderedPageBreak/>
         <w:drawing>
@@ -339,6 +352,45 @@
     </w:p>
     <w:p>
       <w:pPr>
+        <w:pStyle w:val="Caption"/>
+        <w:rPr>
+          <w:rFonts w:ascii="Courier New" w:hAnsi="Courier New" w:cs="Courier New"/>
+        </w:rPr>
+      </w:pPr>
+      <w:r>
+        <w:t xml:space="preserve">Figure </w:t>
+      </w:r>
+      <w:fldSimple w:instr=" SEQ Figure \* ARABIC ">
+        <w:r>
+          <w:rPr>
+            <w:noProof/>
+          </w:rPr>
+          <w:t>1</w:t>
+        </w:r>
+      </w:fldSimple>
+      <w:r>
+        <w:t xml:space="preserve">: Check Docker; </w:t>
+      </w:r>
+      <w:proofErr w:type="gramStart"/>
+      <w:r>
+        <w:t xml:space="preserve">Get </w:t>
+      </w:r>
+      <w:r>
+        <w:rPr>
+          <w:noProof/>
+        </w:rPr>
+        <w:t xml:space="preserve"> network</w:t>
+      </w:r>
+      <w:proofErr w:type="gramEnd"/>
+      <w:r>
+        <w:rPr>
+          <w:noProof/>
+        </w:rPr>
+        <w:t xml:space="preserve"> details</w:t>
+      </w:r>
+    </w:p>
+    <w:p>
+      <w:pPr>
         <w:spacing w:after="0" w:line="240" w:lineRule="auto"/>
         <w:rPr>
           <w:rFonts w:ascii="Courier New" w:hAnsi="Courier New" w:cs="Courier New"/>
@@ -523,14 +575,13 @@
     </w:p>
     <w:p>
       <w:pPr>
+        <w:keepNext/>
         <w:spacing w:after="0" w:line="240" w:lineRule="auto"/>
-        <w:rPr>
-          <w:rFonts w:ascii="Courier New" w:hAnsi="Courier New" w:cs="Courier New"/>
-        </w:rPr>
-      </w:pPr>
-      <w:r>
-        <w:rPr>
-          <w:rFonts w:ascii="Courier New" w:hAnsi="Courier New" w:cs="Courier New"/>
+      </w:pPr>
+      <w:r>
+        <w:rPr>
+          <w:rFonts w:ascii="Courier New" w:hAnsi="Courier New" w:cs="Courier New"/>
+          <w:noProof/>
         </w:rPr>
         <w:drawing>
           <wp:inline distT="0" distB="0" distL="0" distR="0" wp14:anchorId="44B3E9D2" wp14:editId="3BF1962B">
@@ -571,6 +622,28 @@
     </w:p>
     <w:p>
       <w:pPr>
+        <w:pStyle w:val="Caption"/>
+        <w:rPr>
+          <w:rFonts w:ascii="Courier New" w:hAnsi="Courier New" w:cs="Courier New"/>
+        </w:rPr>
+      </w:pPr>
+      <w:r>
+        <w:t xml:space="preserve">Figure </w:t>
+      </w:r>
+      <w:fldSimple w:instr=" SEQ Figure \* ARABIC ">
+        <w:r>
+          <w:rPr>
+            <w:noProof/>
+          </w:rPr>
+          <w:t>2</w:t>
+        </w:r>
+      </w:fldSimple>
+      <w:r>
+        <w:t>: Get a password and store in an env file</w:t>
+      </w:r>
+    </w:p>
+    <w:p>
+      <w:pPr>
         <w:spacing w:after="0" w:line="240" w:lineRule="auto"/>
         <w:rPr>
           <w:rFonts w:ascii="Courier New" w:hAnsi="Courier New" w:cs="Courier New"/>
@@ -601,6 +674,7 @@
         <w:rPr>
           <w:rFonts w:ascii="Courier New" w:hAnsi="Courier New" w:cs="Courier New"/>
         </w:rPr>
+        <w:lastRenderedPageBreak/>
         <w:t>docker volume create mssql1data</w:t>
       </w:r>
     </w:p>
@@ -639,7 +713,6 @@
         <w:rPr>
           <w:rFonts w:ascii="Courier New" w:hAnsi="Courier New" w:cs="Courier New"/>
         </w:rPr>
-        <w:lastRenderedPageBreak/>
         <w:t>-p 100.94.249.116:1433:1433 \</w:t>
       </w:r>
     </w:p>
@@ -751,14 +824,14 @@
     <w:p>
       <w:pPr>
         <w:pStyle w:val="ListParagraph"/>
+        <w:keepNext/>
+        <w:spacing w:after="0" w:line="240" w:lineRule="auto"/>
         <w:ind w:left="0"/>
-        <w:rPr>
-          <w:rFonts w:ascii="Courier New" w:hAnsi="Courier New" w:cs="Courier New"/>
-        </w:rPr>
-      </w:pPr>
-      <w:r>
-        <w:rPr>
-          <w:rFonts w:ascii="Courier New" w:hAnsi="Courier New" w:cs="Courier New"/>
+      </w:pPr>
+      <w:r>
+        <w:rPr>
+          <w:rFonts w:ascii="Courier New" w:hAnsi="Courier New" w:cs="Courier New"/>
+          <w:noProof/>
         </w:rPr>
         <w:drawing>
           <wp:inline distT="0" distB="0" distL="0" distR="0" wp14:anchorId="416CFBE0" wp14:editId="2036BDD6">
@@ -799,6 +872,28 @@
     </w:p>
     <w:p>
       <w:pPr>
+        <w:pStyle w:val="Caption"/>
+        <w:rPr>
+          <w:rFonts w:ascii="Courier New" w:hAnsi="Courier New" w:cs="Courier New"/>
+        </w:rPr>
+      </w:pPr>
+      <w:r>
+        <w:t xml:space="preserve">Figure </w:t>
+      </w:r>
+      <w:fldSimple w:instr=" SEQ Figure \* ARABIC ">
+        <w:r>
+          <w:rPr>
+            <w:noProof/>
+          </w:rPr>
+          <w:t>3</w:t>
+        </w:r>
+      </w:fldSimple>
+      <w:r>
+        <w:t>: Get Docker image; Setup Docker container</w:t>
+      </w:r>
+    </w:p>
+    <w:p>
+      <w:pPr>
         <w:pStyle w:val="ListParagraph"/>
         <w:ind w:left="0"/>
         <w:rPr>
@@ -844,9 +939,14 @@
     <w:p>
       <w:pPr>
         <w:pStyle w:val="ListParagraph"/>
+        <w:keepNext/>
+        <w:spacing w:after="0" w:line="240" w:lineRule="auto"/>
         <w:ind w:left="0"/>
       </w:pPr>
       <w:r>
+        <w:rPr>
+          <w:noProof/>
+        </w:rPr>
         <w:drawing>
           <wp:inline distT="0" distB="0" distL="0" distR="0" wp14:anchorId="1C329705" wp14:editId="7CFB63AD">
             <wp:extent cx="5943600" cy="316230"/>
@@ -886,6 +986,25 @@
     </w:p>
     <w:p>
       <w:pPr>
+        <w:pStyle w:val="Caption"/>
+      </w:pPr>
+      <w:r>
+        <w:t xml:space="preserve">Figure </w:t>
+      </w:r>
+      <w:fldSimple w:instr=" SEQ Figure \* ARABIC ">
+        <w:r>
+          <w:rPr>
+            <w:noProof/>
+          </w:rPr>
+          <w:t>4</w:t>
+        </w:r>
+      </w:fldSimple>
+      <w:r>
+        <w:t>: Validate container is running</w:t>
+      </w:r>
+    </w:p>
+    <w:p>
+      <w:pPr>
         <w:pStyle w:val="ListParagraph"/>
         <w:ind w:left="0"/>
       </w:pPr>
@@ -1036,7 +1155,15 @@
       </w:r>
     </w:p>
     <w:p>
-      <w:r>
+      <w:pPr>
+        <w:keepNext/>
+        <w:spacing w:after="0" w:line="240" w:lineRule="auto"/>
+      </w:pPr>
+      <w:r>
+        <w:rPr>
+          <w:noProof/>
+        </w:rPr>
+        <w:lastRenderedPageBreak/>
         <w:drawing>
           <wp:inline distT="0" distB="0" distL="0" distR="0" wp14:anchorId="16F71F70" wp14:editId="4B7F705F">
             <wp:extent cx="5943600" cy="1264285"/>
@@ -1076,6 +1203,33 @@
     </w:p>
     <w:p>
       <w:pPr>
+        <w:pStyle w:val="Caption"/>
+      </w:pPr>
+      <w:r>
+        <w:t xml:space="preserve">Figure </w:t>
+      </w:r>
+      <w:fldSimple w:instr=" SEQ Figure \* ARABIC ">
+        <w:r>
+          <w:rPr>
+            <w:noProof/>
+          </w:rPr>
+          <w:t>5</w:t>
+        </w:r>
+      </w:fldSimple>
+      <w:r>
+        <w:t xml:space="preserve">: Get version of SQL Server </w:t>
+      </w:r>
+      <w:proofErr w:type="gramStart"/>
+      <w:r>
+        <w:t>off of</w:t>
+      </w:r>
+      <w:proofErr w:type="gramEnd"/>
+      <w:r>
+        <w:t xml:space="preserve"> the server (proves connectivity)</w:t>
+      </w:r>
+    </w:p>
+    <w:p>
+      <w:pPr>
         <w:pStyle w:val="ListParagraph"/>
         <w:numPr>
           <w:ilvl w:val="0"/>
@@ -1157,7 +1311,6 @@
         <w:rPr>
           <w:rFonts w:ascii="Courier New" w:hAnsi="Courier New" w:cs="Courier New"/>
         </w:rPr>
-        <w:lastRenderedPageBreak/>
         <w:t>sudo</w:t>
       </w:r>
       <w:proofErr w:type="spellEnd"/>
@@ -1191,7 +1344,14 @@
       </w:pPr>
     </w:p>
     <w:p>
-      <w:r>
+      <w:pPr>
+        <w:keepNext/>
+        <w:spacing w:after="0" w:line="240" w:lineRule="auto"/>
+      </w:pPr>
+      <w:r>
+        <w:rPr>
+          <w:noProof/>
+        </w:rPr>
         <w:drawing>
           <wp:inline distT="0" distB="0" distL="0" distR="0" wp14:anchorId="531D6CFE" wp14:editId="468B49DE">
             <wp:extent cx="5943600" cy="2938145"/>
@@ -1227,6 +1387,25 @@
             </a:graphic>
           </wp:inline>
         </w:drawing>
+      </w:r>
+    </w:p>
+    <w:p>
+      <w:pPr>
+        <w:pStyle w:val="Caption"/>
+      </w:pPr>
+      <w:r>
+        <w:t xml:space="preserve">Figure </w:t>
+      </w:r>
+      <w:fldSimple w:instr=" SEQ Figure \* ARABIC ">
+        <w:r>
+          <w:rPr>
+            <w:noProof/>
+          </w:rPr>
+          <w:t>6</w:t>
+        </w:r>
+      </w:fldSimple>
+      <w:r>
+        <w:t>: Create firewall rule and validate</w:t>
       </w:r>
     </w:p>
     <w:p>
@@ -2531,6 +2710,25 @@
     <w:basedOn w:val="DefaultParagraphFont"/>
     <w:rsid w:val="00032B6B"/>
   </w:style>
+  <w:style w:type="paragraph" w:styleId="Caption">
+    <w:name w:val="caption"/>
+    <w:basedOn w:val="Normal"/>
+    <w:next w:val="Normal"/>
+    <w:uiPriority w:val="35"/>
+    <w:unhideWhenUsed/>
+    <w:qFormat/>
+    <w:rsid w:val="003F0525"/>
+    <w:pPr>
+      <w:spacing w:after="200" w:line="240" w:lineRule="auto"/>
+    </w:pPr>
+    <w:rPr>
+      <w:i/>
+      <w:iCs/>
+      <w:color w:val="0E2841" w:themeColor="text2"/>
+      <w:sz w:val="18"/>
+      <w:szCs w:val="18"/>
+    </w:rPr>
+  </w:style>
 </w:styles>
 </file>
 

</xml_diff>